<commit_message>
Minor changes and add PDF
</commit_message>
<xml_diff>
--- a/TP_Arduino_Grove_EN.docx
+++ b/TP_Arduino_Grove_EN.docx
@@ -59,7 +59,7 @@
           <w:sz w:val="20"/>
           <w:szCs w:val="20"/>
         </w:rPr>
-        <w:t xml:space="preserve">Master in Chemistry  ·  27 October  ·  1 h 30  ·  Grove Beginner Kit for Arduino</w:t>
+        <w:t xml:space="preserve">Automated Laboratories  ·  27 October  ·  1 h 30  ·  Grove Beginner Kit for Arduino</w:t>
       </w:r>
     </w:p>
     <w:p>
@@ -67,17 +67,17 @@
         <w:spacing w:after="100" w:before="0" w:line="280"/>
       </w:pPr>
       <w:r>
-        <w:t xml:space="preserve">In the previous weeks, you described a laboratory process as a </w:t>
+        <w:t xml:space="preserve">In the previous weeks, you had to </w:t>
       </w:r>
       <w:r>
         <w:rPr>
           <w:b/>
           <w:bCs/>
         </w:rPr>
-        <w:t xml:space="preserve">manual workflow</w:t>
-      </w:r>
-      <w:r>
-        <w:t xml:space="preserve">: what the operator does, what they measure or observe, and what they decide. Today you will see how a small piece of it can be </w:t>
+        <w:t xml:space="preserve">establish the complete workflow of chemical and manual operations, with all the logic, and define the necessary equipment in terms of chemistry</w:t>
+      </w:r>
+      <w:r>
+        <w:t xml:space="preserve">. Today you will see how a small piece of it can be </w:t>
       </w:r>
       <w:r>
         <w:rPr>
@@ -399,7 +399,7 @@
                 <w:sz w:val="20"/>
                 <w:szCs w:val="20"/>
               </w:rPr>
-              <w:t xml:space="preserve">Meet the kit, set up the Arduino IDE, upload a first program</w:t>
+              <w:t xml:space="preserve">Get the code from GitHub, set up the Arduino IDE, upload a first program</w:t>
             </w:r>
           </w:p>
         </w:tc>
@@ -428,7 +428,7 @@
                 <w:sz w:val="20"/>
                 <w:szCs w:val="20"/>
               </w:rPr>
-              <w:t xml:space="preserve">10 min</w:t>
+              <w:t xml:space="preserve">15 min</w:t>
             </w:r>
           </w:p>
         </w:tc>
@@ -599,7 +599,7 @@
                 <w:sz w:val="20"/>
                 <w:szCs w:val="20"/>
               </w:rPr>
-              <w:t xml:space="preserve"> see the measurements (Serial Monitor and Plotter, screen); </w:t>
+              <w:t xml:space="preserve"> see the measurements (Serial Monitor, Serial Plotter, screen); </w:t>
             </w:r>
             <w:r>
               <w:rPr>
@@ -644,7 +644,7 @@
                 <w:sz w:val="20"/>
                 <w:szCs w:val="20"/>
               </w:rPr>
-              <w:t xml:space="preserve">25 min</w:t>
+              <w:t xml:space="preserve">20 min</w:t>
             </w:r>
           </w:p>
         </w:tc>
@@ -806,7 +806,7 @@
                 <w:sz w:val="20"/>
                 <w:szCs w:val="20"/>
               </w:rPr>
-              <w:t xml:space="preserve">Take a feature of your manual workflow, draw its automated version, and simulate it on the kit, with the help of an AI</w:t>
+              <w:t xml:space="preserve">Take a feature of your workflow, draw its automated version, and simulate it on the kit, with the help of an AI</w:t>
             </w:r>
           </w:p>
         </w:tc>
@@ -1223,7 +1223,27 @@
         <w:spacing w:after="60" w:line="276"/>
       </w:pPr>
       <w:r>
-        <w:t xml:space="preserve">Open </w:t>
+        <w:t xml:space="preserve">Get the code from GitHub: </w:t>
+      </w:r>
+      <w:r>
+        <w:rPr>
+          <w:b/>
+          <w:bCs/>
+        </w:rPr>
+        <w:t xml:space="preserve">https://github.com/swisscatplus/Arduino_Grove.git</w:t>
+      </w:r>
+      <w:r>
+        <w:t xml:space="preserve">. Either </w:t>
+      </w:r>
+      <w:r>
+        <w:rPr>
+          <w:b/>
+          <w:bCs/>
+        </w:rPr>
+        <w:t xml:space="preserve">clone</w:t>
+      </w:r>
+      <w:r>
+        <w:t xml:space="preserve"> it (</w:t>
       </w:r>
       <w:r>
         <w:rPr>
@@ -1232,10 +1252,111 @@
           <w:sz w:val="20"/>
           <w:szCs w:val="20"/>
         </w:rPr>
+        <w:t xml:space="preserve">git clone https://github.com/swisscatplus/Arduino_Grove.git</w:t>
+      </w:r>
+      <w:r>
+        <w:t xml:space="preserve">), or </w:t>
+      </w:r>
+      <w:r>
+        <w:rPr>
+          <w:b/>
+          <w:bCs/>
+        </w:rPr>
+        <w:t xml:space="preserve">download</w:t>
+      </w:r>
+      <w:r>
+        <w:t xml:space="preserve"> it (on the repository page: green </w:t>
+      </w:r>
+      <w:r>
+        <w:rPr>
+          <w:b/>
+          <w:bCs/>
+        </w:rPr>
+        <w:t xml:space="preserve">Code</w:t>
+      </w:r>
+      <w:r>
+        <w:t xml:space="preserve"> button → </w:t>
+      </w:r>
+      <w:r>
+        <w:rPr>
+          <w:b/>
+          <w:bCs/>
+        </w:rPr>
+        <w:t xml:space="preserve">Download ZIP</w:t>
+      </w:r>
+      <w:r>
+        <w:t xml:space="preserve">, then extract it). The Arduino IDE needs the folder that contains </w:t>
+      </w:r>
+      <w:r>
+        <w:rPr>
+          <w:rFonts w:ascii="Consolas" w:cs="Consolas" w:eastAsia="Consolas" w:hAnsi="Consolas"/>
+          <w:color w:val="9A2B2B"/>
+          <w:sz w:val="20"/>
+          <w:szCs w:val="20"/>
+        </w:rPr>
         <w:t xml:space="preserve">Arduino_Grove.ino</w:t>
       </w:r>
       <w:r>
-        <w:t xml:space="preserve"> in the Arduino IDE (your instructor tells you where it is). A second tab, </w:t>
+        <w:t xml:space="preserve"> to be named exactly </w:t>
+      </w:r>
+      <w:r>
+        <w:rPr>
+          <w:rFonts w:ascii="Consolas" w:cs="Consolas" w:eastAsia="Consolas" w:hAnsi="Consolas"/>
+          <w:color w:val="9A2B2B"/>
+          <w:sz w:val="20"/>
+          <w:szCs w:val="20"/>
+        </w:rPr>
+        <w:t xml:space="preserve">Arduino_Grove</w:t>
+      </w:r>
+      <w:r>
+        <w:t xml:space="preserve">: rename it if you downloaded the ZIP (GitHub adds </w:t>
+      </w:r>
+      <w:r>
+        <w:rPr>
+          <w:rFonts w:ascii="Consolas" w:cs="Consolas" w:eastAsia="Consolas" w:hAnsi="Consolas"/>
+          <w:color w:val="9A2B2B"/>
+          <w:sz w:val="20"/>
+          <w:szCs w:val="20"/>
+        </w:rPr>
+        <w:t xml:space="preserve">-main</w:t>
+      </w:r>
+      <w:r>
+        <w:t xml:space="preserve">).</w:t>
+      </w:r>
+    </w:p>
+    <w:p>
+      <w:pPr>
+        <w:pStyle w:val="ListParagraph"/>
+        <w:numPr>
+          <w:ilvl w:val="0"/>
+          <w:numId w:val="3"/>
+        </w:numPr>
+        <w:spacing w:after="60" w:line="276"/>
+      </w:pPr>
+      <w:r>
+        <w:t xml:space="preserve">Open </w:t>
+      </w:r>
+      <w:r>
+        <w:rPr>
+          <w:rFonts w:ascii="Consolas" w:cs="Consolas" w:eastAsia="Consolas" w:hAnsi="Consolas"/>
+          <w:color w:val="9A2B2B"/>
+          <w:sz w:val="20"/>
+          <w:szCs w:val="20"/>
+        </w:rPr>
+        <w:t xml:space="preserve">Arduino_Grove.ino</w:t>
+      </w:r>
+      <w:r>
+        <w:t xml:space="preserve"> in the Arduino IDE (</w:t>
+      </w:r>
+      <w:r>
+        <w:rPr>
+          <w:b/>
+          <w:bCs/>
+        </w:rPr>
+        <w:t xml:space="preserve">File → Open...</w:t>
+      </w:r>
+      <w:r>
+        <w:t xml:space="preserve">). A second tab, </w:t>
       </w:r>
       <w:r>
         <w:rPr>
@@ -3260,31 +3381,6 @@
     </w:p>
     <w:p>
       <w:pPr>
-        <w:pStyle w:val="ListParagraph"/>
-        <w:numPr>
-          <w:ilvl w:val="0"/>
-          <w:numId w:val="4"/>
-        </w:numPr>
-        <w:spacing w:after="60" w:line="276"/>
-      </w:pPr>
-      <w:r>
-        <w:t xml:space="preserve">Delete the whole </w:t>
-      </w:r>
-      <w:r>
-        <w:rPr>
-          <w:rFonts w:ascii="Consolas" w:cs="Consolas" w:eastAsia="Consolas" w:hAnsi="Consolas"/>
-          <w:color w:val="9A2B2B"/>
-          <w:sz w:val="20"/>
-          <w:szCs w:val="20"/>
-        </w:rPr>
-        <w:t xml:space="preserve">else { ... }</w:t>
-      </w:r>
-      <w:r>
-        <w:t xml:space="preserve"> part. What changes? Why?</w:t>
-      </w:r>
-    </w:p>
-    <w:p>
-      <w:pPr>
         <w:spacing w:after="60" w:before="0"/>
       </w:pPr>
     </w:p>
@@ -3383,7 +3479,7 @@
         <w:spacing w:after="100" w:before="240"/>
       </w:pPr>
       <w:r>
-        <w:t xml:space="preserve">2a. See what the sensor measures  (10 min)</w:t>
+        <w:t xml:space="preserve">2a. See what the sensor measures  (8 min)</w:t>
       </w:r>
     </w:p>
     <w:tbl>
@@ -3671,454 +3767,7 @@
         <w:spacing w:after="60" w:line="276"/>
       </w:pPr>
       <w:r>
-        <w:t xml:space="preserve">Cover the light sensor with your hand, then shine a phone torch on it. Fill the table below.</w:t>
-      </w:r>
-    </w:p>
-    <w:p>
-      <w:pPr>
-        <w:spacing w:after="40" w:before="0"/>
-      </w:pPr>
-    </w:p>
-    <w:tbl>
-      <w:tblPr>
-        <w:tblW w:type="dxa" w:w="9638"/>
-        <w:tblBorders>
-          <w:top w:val="single" w:color="auto" w:sz="4"/>
-          <w:left w:val="single" w:color="auto" w:sz="4"/>
-          <w:bottom w:val="single" w:color="auto" w:sz="4"/>
-          <w:right w:val="single" w:color="auto" w:sz="4"/>
-          <w:insideH w:val="single" w:color="auto" w:sz="4"/>
-          <w:insideV w:val="single" w:color="auto" w:sz="4"/>
-        </w:tblBorders>
-      </w:tblPr>
-      <w:tblGrid>
-        <w:gridCol w:w="4200"/>
-        <w:gridCol w:w="2719"/>
-        <w:gridCol w:w="2719"/>
-      </w:tblGrid>
-      <w:tr>
-        <w:trPr>
-          <w:cantSplit/>
-          <w:tblHeader/>
-        </w:trPr>
-        <w:tc>
-          <w:tcPr>
-            <w:tcW w:type="dxa" w:w="4200"/>
-            <w:tcBorders>
-              <w:top w:val="single" w:color="BBBBBB" w:sz="4"/>
-              <w:left w:val="single" w:color="BBBBBB" w:sz="4"/>
-              <w:bottom w:val="single" w:color="BBBBBB" w:sz="4"/>
-              <w:right w:val="single" w:color="BBBBBB" w:sz="4"/>
-            </w:tcBorders>
-            <w:shd w:fill="1F5C8B" w:color="auto" w:val="clear"/>
-            <w:tcMar>
-              <w:top w:type="dxa" w:w="70"/>
-              <w:left w:type="dxa" w:w="110"/>
-              <w:bottom w:type="dxa" w:w="70"/>
-              <w:right w:type="dxa" w:w="110"/>
-            </w:tcMar>
-          </w:tcPr>
-          <w:p>
-            <w:pPr>
-              <w:spacing w:after="0" w:line="260"/>
-            </w:pPr>
-            <w:r>
-              <w:rPr>
-                <w:b/>
-                <w:bCs/>
-                <w:color w:val="FFFFFF"/>
-                <w:sz w:val="20"/>
-                <w:szCs w:val="20"/>
-              </w:rPr>
-              <w:t xml:space="preserve">Situation</w:t>
-            </w:r>
-          </w:p>
-        </w:tc>
-        <w:tc>
-          <w:tcPr>
-            <w:tcW w:type="dxa" w:w="2719"/>
-            <w:tcBorders>
-              <w:top w:val="single" w:color="BBBBBB" w:sz="4"/>
-              <w:left w:val="single" w:color="BBBBBB" w:sz="4"/>
-              <w:bottom w:val="single" w:color="BBBBBB" w:sz="4"/>
-              <w:right w:val="single" w:color="BBBBBB" w:sz="4"/>
-            </w:tcBorders>
-            <w:shd w:fill="1F5C8B" w:color="auto" w:val="clear"/>
-            <w:tcMar>
-              <w:top w:type="dxa" w:w="70"/>
-              <w:left w:type="dxa" w:w="110"/>
-              <w:bottom w:type="dxa" w:w="70"/>
-              <w:right w:type="dxa" w:w="110"/>
-            </w:tcMar>
-          </w:tcPr>
-          <w:p>
-            <w:pPr>
-              <w:spacing w:after="0" w:line="260"/>
-            </w:pPr>
-            <w:r>
-              <w:rPr>
-                <w:b/>
-                <w:bCs/>
-                <w:color w:val="FFFFFF"/>
-                <w:sz w:val="20"/>
-                <w:szCs w:val="20"/>
-              </w:rPr>
-              <w:t xml:space="preserve">Value</w:t>
-            </w:r>
-          </w:p>
-        </w:tc>
-        <w:tc>
-          <w:tcPr>
-            <w:tcW w:type="dxa" w:w="2719"/>
-            <w:tcBorders>
-              <w:top w:val="single" w:color="BBBBBB" w:sz="4"/>
-              <w:left w:val="single" w:color="BBBBBB" w:sz="4"/>
-              <w:bottom w:val="single" w:color="BBBBBB" w:sz="4"/>
-              <w:right w:val="single" w:color="BBBBBB" w:sz="4"/>
-            </w:tcBorders>
-            <w:shd w:fill="1F5C8B" w:color="auto" w:val="clear"/>
-            <w:tcMar>
-              <w:top w:type="dxa" w:w="70"/>
-              <w:left w:type="dxa" w:w="110"/>
-              <w:bottom w:type="dxa" w:w="70"/>
-              <w:right w:type="dxa" w:w="110"/>
-            </w:tcMar>
-          </w:tcPr>
-          <w:p>
-            <w:pPr>
-              <w:spacing w:after="0" w:line="260"/>
-            </w:pPr>
-            <w:r>
-              <w:rPr>
-                <w:b/>
-                <w:bCs/>
-                <w:color w:val="FFFFFF"/>
-                <w:sz w:val="20"/>
-                <w:szCs w:val="20"/>
-              </w:rPr>
-              <w:t xml:space="preserve">Goes up or down?</w:t>
-            </w:r>
-          </w:p>
-        </w:tc>
-      </w:tr>
-      <w:tr>
-        <w:trPr>
-          <w:cantSplit/>
-        </w:trPr>
-        <w:tc>
-          <w:tcPr>
-            <w:tcW w:type="dxa" w:w="4200"/>
-            <w:tcBorders>
-              <w:top w:val="single" w:color="BBBBBB" w:sz="4"/>
-              <w:left w:val="single" w:color="BBBBBB" w:sz="4"/>
-              <w:bottom w:val="single" w:color="BBBBBB" w:sz="4"/>
-              <w:right w:val="single" w:color="BBBBBB" w:sz="4"/>
-            </w:tcBorders>
-            <w:tcMar>
-              <w:top w:type="dxa" w:w="70"/>
-              <w:left w:type="dxa" w:w="110"/>
-              <w:bottom w:type="dxa" w:w="70"/>
-              <w:right w:type="dxa" w:w="110"/>
-            </w:tcMar>
-          </w:tcPr>
-          <w:p>
-            <w:pPr>
-              <w:spacing w:after="0" w:line="260"/>
-            </w:pPr>
-            <w:r>
-              <w:rPr>
-                <w:sz w:val="20"/>
-                <w:szCs w:val="20"/>
-              </w:rPr>
-              <w:t xml:space="preserve">Normal room light</w:t>
-            </w:r>
-          </w:p>
-        </w:tc>
-        <w:tc>
-          <w:tcPr>
-            <w:tcW w:type="dxa" w:w="2719"/>
-            <w:tcBorders>
-              <w:top w:val="single" w:color="BBBBBB" w:sz="4"/>
-              <w:left w:val="single" w:color="BBBBBB" w:sz="4"/>
-              <w:bottom w:val="single" w:color="BBBBBB" w:sz="4"/>
-              <w:right w:val="single" w:color="BBBBBB" w:sz="4"/>
-            </w:tcBorders>
-            <w:tcMar>
-              <w:top w:type="dxa" w:w="70"/>
-              <w:left w:type="dxa" w:w="110"/>
-              <w:bottom w:type="dxa" w:w="70"/>
-              <w:right w:type="dxa" w:w="110"/>
-            </w:tcMar>
-          </w:tcPr>
-          <w:p>
-            <w:pPr>
-              <w:spacing w:after="0" w:line="260"/>
-            </w:pPr>
-            <w:r>
-              <w:rPr>
-                <w:sz w:val="20"/>
-                <w:szCs w:val="20"/>
-              </w:rPr>
-              <w:t xml:space="preserve"> </w:t>
-            </w:r>
-          </w:p>
-        </w:tc>
-        <w:tc>
-          <w:tcPr>
-            <w:tcW w:type="dxa" w:w="2719"/>
-            <w:tcBorders>
-              <w:top w:val="single" w:color="BBBBBB" w:sz="4"/>
-              <w:left w:val="single" w:color="BBBBBB" w:sz="4"/>
-              <w:bottom w:val="single" w:color="BBBBBB" w:sz="4"/>
-              <w:right w:val="single" w:color="BBBBBB" w:sz="4"/>
-            </w:tcBorders>
-            <w:tcMar>
-              <w:top w:type="dxa" w:w="70"/>
-              <w:left w:type="dxa" w:w="110"/>
-              <w:bottom w:type="dxa" w:w="70"/>
-              <w:right w:type="dxa" w:w="110"/>
-            </w:tcMar>
-          </w:tcPr>
-          <w:p>
-            <w:pPr>
-              <w:spacing w:after="0" w:line="260"/>
-            </w:pPr>
-            <w:r>
-              <w:rPr>
-                <w:sz w:val="20"/>
-                <w:szCs w:val="20"/>
-              </w:rPr>
-              <w:t xml:space="preserve"> </w:t>
-            </w:r>
-          </w:p>
-        </w:tc>
-      </w:tr>
-      <w:tr>
-        <w:trPr>
-          <w:cantSplit/>
-        </w:trPr>
-        <w:tc>
-          <w:tcPr>
-            <w:tcW w:type="dxa" w:w="4200"/>
-            <w:tcBorders>
-              <w:top w:val="single" w:color="BBBBBB" w:sz="4"/>
-              <w:left w:val="single" w:color="BBBBBB" w:sz="4"/>
-              <w:bottom w:val="single" w:color="BBBBBB" w:sz="4"/>
-              <w:right w:val="single" w:color="BBBBBB" w:sz="4"/>
-            </w:tcBorders>
-            <w:shd w:fill="F7F9FB" w:color="auto" w:val="clear"/>
-            <w:tcMar>
-              <w:top w:type="dxa" w:w="70"/>
-              <w:left w:type="dxa" w:w="110"/>
-              <w:bottom w:type="dxa" w:w="70"/>
-              <w:right w:type="dxa" w:w="110"/>
-            </w:tcMar>
-          </w:tcPr>
-          <w:p>
-            <w:pPr>
-              <w:spacing w:after="0" w:line="260"/>
-            </w:pPr>
-            <w:r>
-              <w:rPr>
-                <w:sz w:val="20"/>
-                <w:szCs w:val="20"/>
-              </w:rPr>
-              <w:t xml:space="preserve">Sensor covered by your hand</w:t>
-            </w:r>
-          </w:p>
-        </w:tc>
-        <w:tc>
-          <w:tcPr>
-            <w:tcW w:type="dxa" w:w="2719"/>
-            <w:tcBorders>
-              <w:top w:val="single" w:color="BBBBBB" w:sz="4"/>
-              <w:left w:val="single" w:color="BBBBBB" w:sz="4"/>
-              <w:bottom w:val="single" w:color="BBBBBB" w:sz="4"/>
-              <w:right w:val="single" w:color="BBBBBB" w:sz="4"/>
-            </w:tcBorders>
-            <w:shd w:fill="F7F9FB" w:color="auto" w:val="clear"/>
-            <w:tcMar>
-              <w:top w:type="dxa" w:w="70"/>
-              <w:left w:type="dxa" w:w="110"/>
-              <w:bottom w:type="dxa" w:w="70"/>
-              <w:right w:type="dxa" w:w="110"/>
-            </w:tcMar>
-          </w:tcPr>
-          <w:p>
-            <w:pPr>
-              <w:spacing w:after="0" w:line="260"/>
-            </w:pPr>
-            <w:r>
-              <w:rPr>
-                <w:sz w:val="20"/>
-                <w:szCs w:val="20"/>
-              </w:rPr>
-              <w:t xml:space="preserve"> </w:t>
-            </w:r>
-          </w:p>
-        </w:tc>
-        <w:tc>
-          <w:tcPr>
-            <w:tcW w:type="dxa" w:w="2719"/>
-            <w:tcBorders>
-              <w:top w:val="single" w:color="BBBBBB" w:sz="4"/>
-              <w:left w:val="single" w:color="BBBBBB" w:sz="4"/>
-              <w:bottom w:val="single" w:color="BBBBBB" w:sz="4"/>
-              <w:right w:val="single" w:color="BBBBBB" w:sz="4"/>
-            </w:tcBorders>
-            <w:shd w:fill="F7F9FB" w:color="auto" w:val="clear"/>
-            <w:tcMar>
-              <w:top w:type="dxa" w:w="70"/>
-              <w:left w:type="dxa" w:w="110"/>
-              <w:bottom w:type="dxa" w:w="70"/>
-              <w:right w:type="dxa" w:w="110"/>
-            </w:tcMar>
-          </w:tcPr>
-          <w:p>
-            <w:pPr>
-              <w:spacing w:after="0" w:line="260"/>
-            </w:pPr>
-            <w:r>
-              <w:rPr>
-                <w:sz w:val="20"/>
-                <w:szCs w:val="20"/>
-              </w:rPr>
-              <w:t xml:space="preserve"> </w:t>
-            </w:r>
-          </w:p>
-        </w:tc>
-      </w:tr>
-      <w:tr>
-        <w:trPr>
-          <w:cantSplit/>
-        </w:trPr>
-        <w:tc>
-          <w:tcPr>
-            <w:tcW w:type="dxa" w:w="4200"/>
-            <w:tcBorders>
-              <w:top w:val="single" w:color="BBBBBB" w:sz="4"/>
-              <w:left w:val="single" w:color="BBBBBB" w:sz="4"/>
-              <w:bottom w:val="single" w:color="BBBBBB" w:sz="4"/>
-              <w:right w:val="single" w:color="BBBBBB" w:sz="4"/>
-            </w:tcBorders>
-            <w:tcMar>
-              <w:top w:type="dxa" w:w="70"/>
-              <w:left w:type="dxa" w:w="110"/>
-              <w:bottom w:type="dxa" w:w="70"/>
-              <w:right w:type="dxa" w:w="110"/>
-            </w:tcMar>
-          </w:tcPr>
-          <w:p>
-            <w:pPr>
-              <w:spacing w:after="0" w:line="260"/>
-            </w:pPr>
-            <w:r>
-              <w:rPr>
-                <w:sz w:val="20"/>
-                <w:szCs w:val="20"/>
-              </w:rPr>
-              <w:t xml:space="preserve">Phone torch right on the sensor</w:t>
-            </w:r>
-          </w:p>
-        </w:tc>
-        <w:tc>
-          <w:tcPr>
-            <w:tcW w:type="dxa" w:w="2719"/>
-            <w:tcBorders>
-              <w:top w:val="single" w:color="BBBBBB" w:sz="4"/>
-              <w:left w:val="single" w:color="BBBBBB" w:sz="4"/>
-              <w:bottom w:val="single" w:color="BBBBBB" w:sz="4"/>
-              <w:right w:val="single" w:color="BBBBBB" w:sz="4"/>
-            </w:tcBorders>
-            <w:tcMar>
-              <w:top w:type="dxa" w:w="70"/>
-              <w:left w:type="dxa" w:w="110"/>
-              <w:bottom w:type="dxa" w:w="70"/>
-              <w:right w:type="dxa" w:w="110"/>
-            </w:tcMar>
-          </w:tcPr>
-          <w:p>
-            <w:pPr>
-              <w:spacing w:after="0" w:line="260"/>
-            </w:pPr>
-            <w:r>
-              <w:rPr>
-                <w:sz w:val="20"/>
-                <w:szCs w:val="20"/>
-              </w:rPr>
-              <w:t xml:space="preserve"> </w:t>
-            </w:r>
-          </w:p>
-        </w:tc>
-        <w:tc>
-          <w:tcPr>
-            <w:tcW w:type="dxa" w:w="2719"/>
-            <w:tcBorders>
-              <w:top w:val="single" w:color="BBBBBB" w:sz="4"/>
-              <w:left w:val="single" w:color="BBBBBB" w:sz="4"/>
-              <w:bottom w:val="single" w:color="BBBBBB" w:sz="4"/>
-              <w:right w:val="single" w:color="BBBBBB" w:sz="4"/>
-            </w:tcBorders>
-            <w:tcMar>
-              <w:top w:type="dxa" w:w="70"/>
-              <w:left w:type="dxa" w:w="110"/>
-              <w:bottom w:type="dxa" w:w="70"/>
-              <w:right w:type="dxa" w:w="110"/>
-            </w:tcMar>
-          </w:tcPr>
-          <w:p>
-            <w:pPr>
-              <w:spacing w:after="0" w:line="260"/>
-            </w:pPr>
-            <w:r>
-              <w:rPr>
-                <w:sz w:val="20"/>
-                <w:szCs w:val="20"/>
-              </w:rPr>
-              <w:t xml:space="preserve"> </w:t>
-            </w:r>
-          </w:p>
-        </w:tc>
-      </w:tr>
-    </w:tbl>
-    <w:p>
-      <w:pPr>
-        <w:spacing w:after="60" w:before="0"/>
-      </w:pPr>
-    </w:p>
-    <w:p>
-      <w:pPr>
-        <w:spacing w:after="100" w:before="0" w:line="280"/>
-      </w:pPr>
-      <w:r>
-        <w:rPr>
-          <w:b/>
-          <w:bCs/>
-        </w:rPr>
-        <w:t xml:space="preserve">Question:</w:t>
-      </w:r>
-      <w:r>
-        <w:t xml:space="preserve"> does the number go </w:t>
-      </w:r>
-      <w:r>
-        <w:rPr>
-          <w:i/>
-          <w:iCs/>
-        </w:rPr>
-        <w:t xml:space="preserve">up</w:t>
-      </w:r>
-      <w:r>
-        <w:t xml:space="preserve"> or </w:t>
-      </w:r>
-      <w:r>
-        <w:rPr>
-          <w:i/>
-          <w:iCs/>
-        </w:rPr>
-        <w:t xml:space="preserve">down</w:t>
-      </w:r>
-      <w:r>
-        <w:t xml:space="preserve"> when it gets darker? Keep this in mind for 2b.</w:t>
+        <w:t xml:space="preserve">Cover the light sensor with your hand, then shine a phone torch on it, and watch how the values change.</w:t>
       </w:r>
     </w:p>
     <w:p>
@@ -4128,7 +3777,7 @@
         <w:spacing w:after="100" w:before="240"/>
       </w:pPr>
       <w:r>
-        <w:t xml:space="preserve">2b. Act: switch the LED on when it gets dark  (15 min)</w:t>
+        <w:t xml:space="preserve">2b. Act: switch the LED on when it gets dark  (12 min)</w:t>
       </w:r>
     </w:p>
     <w:tbl>
@@ -4239,17 +3888,7 @@
         <w:t xml:space="preserve">const</w:t>
       </w:r>
       <w:r>
-        <w:t xml:space="preserve"> line goes just above it). This version </w:t>
-      </w:r>
-      <w:r>
-        <w:rPr>
-          <w:b/>
-          <w:bCs/>
-        </w:rPr>
-        <w:t xml:space="preserve">runs, but does not do the right thing yet</w:t>
-      </w:r>
-      <w:r>
-        <w:t xml:space="preserve">: your job is to fix it.</w:t>
+        <w:t xml:space="preserve"> line goes just above it).</w:t>
       </w:r>
     </w:p>
     <w:p>
@@ -4269,7 +3908,7 @@
           <w:sz w:val="19"/>
           <w:szCs w:val="19"/>
         </w:rPr>
-        <w:t xml:space="preserve">const int THRESHOLD = 0;       // &lt;-- 1) choose a value, using what you measured in 2a</w:t>
+        <w:t xml:space="preserve">const int THRESHOLD = 0;       // the LED turns on below this light level</w:t>
       </w:r>
     </w:p>
     <w:p>
@@ -4369,7 +4008,7 @@
           <w:sz w:val="19"/>
           <w:szCs w:val="19"/>
         </w:rPr>
-        <w:t xml:space="preserve">  if (light &gt; THRESHOLD) {     // &lt;-- 2) is "&gt;" the right comparison? Or "&lt;" ?</w:t>
+        <w:t xml:space="preserve">  if (light &lt; THRESHOLD) {</w:t>
       </w:r>
     </w:p>
     <w:p>
@@ -4622,17 +4261,17 @@
         <w:spacing w:after="60" w:line="276"/>
       </w:pPr>
       <w:r>
-        <w:t xml:space="preserve">Pick a threshold </w:t>
+        <w:t xml:space="preserve">Upload, open the </w:t>
       </w:r>
       <w:r>
         <w:rPr>
           <w:b/>
           <w:bCs/>
         </w:rPr>
-        <w:t xml:space="preserve">between</w:t>
-      </w:r>
-      <w:r>
-        <w:t xml:space="preserve"> your "normal light" and "covered" values.</w:t>
+        <w:t xml:space="preserve">Serial Plotter</w:t>
+      </w:r>
+      <w:r>
+        <w:t xml:space="preserve"> and cover / uncover the sensor: you see the light curve and the threshold line.</w:t>
       </w:r>
     </w:p>
     <w:p>
@@ -4645,30 +4284,26 @@
         <w:spacing w:after="60" w:line="276"/>
       </w:pPr>
       <w:r>
-        <w:t xml:space="preserve">Check the comparison sign so that the LED lights up when you </w:t>
-      </w:r>
-      <w:r>
         <w:rPr>
           <w:b/>
           <w:bCs/>
         </w:rPr>
-        <w:t xml:space="preserve">cover</w:t>
-      </w:r>
-      <w:r>
-        <w:t xml:space="preserve"> the sensor. In the Serial Plotter you see the light curve cross the threshold line at the moment the LED switches.</w:t>
-      </w:r>
-    </w:p>
-    <w:p>
-      <w:pPr>
-        <w:pStyle w:val="ListParagraph"/>
-        <w:numPr>
-          <w:ilvl w:val="0"/>
-          <w:numId w:val="6"/>
-        </w:numPr>
-        <w:spacing w:after="60" w:line="276"/>
-      </w:pPr>
-      <w:r>
-        <w:t xml:space="preserve">Upload and test by covering / uncovering the sensor.</w:t>
+        <w:t xml:space="preserve">Change</w:t>
+      </w:r>
+      <w:r>
+        <w:t xml:space="preserve"> </w:t>
+      </w:r>
+      <w:r>
+        <w:rPr>
+          <w:rFonts w:ascii="Consolas" w:cs="Consolas" w:eastAsia="Consolas" w:hAnsi="Consolas"/>
+          <w:color w:val="9A2B2B"/>
+          <w:sz w:val="20"/>
+          <w:szCs w:val="20"/>
+        </w:rPr>
+        <w:t xml:space="preserve">THRESHOLD</w:t>
+      </w:r>
+      <w:r>
+        <w:t xml:space="preserve"> and upload again, until the LED switches on at the light level you want (for example when you partly cover the sensor). The LED switches at the moment the light curve crosses the threshold line.</w:t>
       </w:r>
     </w:p>
     <w:p>

</xml_diff>

<commit_message>
Added USB driver support
</commit_message>
<xml_diff>
--- a/TP_Arduino_Grove_EN.docx
+++ b/TP_Arduino_Grove_EN.docx
@@ -1514,7 +1514,7 @@
         <w:t xml:space="preserve">Tools → Port</w:t>
       </w:r>
       <w:r>
-        <w:t xml:space="preserve"> (the one that appears when the kit is plugged in).</w:t>
+        <w:t xml:space="preserve"> (the one that appears when the kit is plugged in). No port? The board probably needs a USB driver: see the box below.</w:t>
       </w:r>
     </w:p>
     <w:p>
@@ -1550,6 +1550,298 @@
         <w:t xml:space="preserve">. You are ready.</w:t>
       </w:r>
     </w:p>
+    <w:p>
+      <w:pPr>
+        <w:spacing w:after="80" w:before="0"/>
+      </w:pPr>
+    </w:p>
+    <w:tbl>
+      <w:tblPr>
+        <w:tblW w:type="dxa" w:w="9638"/>
+        <w:tblBorders>
+          <w:top w:val="single" w:color="auto" w:sz="4"/>
+          <w:left w:val="single" w:color="auto" w:sz="4"/>
+          <w:bottom w:val="single" w:color="auto" w:sz="4"/>
+          <w:right w:val="single" w:color="auto" w:sz="4"/>
+          <w:insideH w:val="single" w:color="auto" w:sz="4"/>
+          <w:insideV w:val="single" w:color="auto" w:sz="4"/>
+        </w:tblBorders>
+      </w:tblPr>
+      <w:tblGrid>
+        <w:gridCol w:w="9638"/>
+      </w:tblGrid>
+      <w:tr>
+        <w:trPr>
+          <w:cantSplit/>
+        </w:trPr>
+        <w:tc>
+          <w:tcPr>
+            <w:tcW w:type="dxa" w:w="9638"/>
+            <w:tcBorders>
+              <w:top w:val="none" w:color="FFFFFF" w:sz="0"/>
+              <w:left w:val="single" w:color="E0A100" w:sz="24"/>
+              <w:bottom w:val="none" w:color="FFFFFF" w:sz="0"/>
+              <w:right w:val="none" w:color="FFFFFF" w:sz="0"/>
+            </w:tcBorders>
+            <w:shd w:fill="FFF6E0" w:color="auto" w:val="clear"/>
+            <w:tcMar>
+              <w:top w:type="dxa" w:w="100"/>
+              <w:left w:type="dxa" w:w="180"/>
+              <w:bottom w:type="dxa" w:w="80"/>
+              <w:right w:type="dxa" w:w="160"/>
+            </w:tcMar>
+          </w:tcPr>
+          <w:p>
+            <w:pPr>
+              <w:keepNext/>
+              <w:spacing w:after="60"/>
+            </w:pPr>
+            <w:r>
+              <w:rPr>
+                <w:b/>
+                <w:bCs/>
+                <w:color w:val="8A6100"/>
+                <w:sz w:val="22"/>
+                <w:szCs w:val="22"/>
+              </w:rPr>
+              <w:t xml:space="preserve">No port in Tools → Port? Install the USB driver</w:t>
+            </w:r>
+          </w:p>
+          <w:p>
+            <w:pPr>
+              <w:spacing w:after="60" w:before="0" w:line="280"/>
+            </w:pPr>
+            <w:r>
+              <w:t xml:space="preserve">The board of the kit uses a Silicon Labs </w:t>
+            </w:r>
+            <w:r>
+              <w:rPr>
+                <w:b/>
+                <w:bCs/>
+              </w:rPr>
+              <w:t xml:space="preserve">CP210x</w:t>
+            </w:r>
+            <w:r>
+              <w:t xml:space="preserve"> USB chip, which needs a driver on most computers (administrator rights required). Go to https://www.silabs.com/software-and-tools/usb-to-uart-bridge-vcp-drivers?tab=overview, open the </w:t>
+            </w:r>
+            <w:r>
+              <w:rPr>
+                <w:b/>
+                <w:bCs/>
+              </w:rPr>
+              <w:t xml:space="preserve">Downloads</w:t>
+            </w:r>
+            <w:r>
+              <w:t xml:space="preserve"> tab, and download the driver for your system:</w:t>
+            </w:r>
+          </w:p>
+          <w:p>
+            <w:pPr>
+              <w:pStyle w:val="ListParagraph"/>
+              <w:numPr>
+                <w:ilvl w:val="0"/>
+                <w:numId w:val="2"/>
+              </w:numPr>
+              <w:spacing w:after="50" w:line="276"/>
+            </w:pPr>
+            <w:r>
+              <w:rPr>
+                <w:b/>
+                <w:bCs/>
+              </w:rPr>
+              <w:t xml:space="preserve">Windows 10 / 11:</w:t>
+            </w:r>
+            <w:r>
+              <w:t xml:space="preserve"> </w:t>
+            </w:r>
+            <w:r>
+              <w:rPr>
+                <w:i/>
+                <w:iCs/>
+              </w:rPr>
+              <w:t xml:space="preserve">CP210x Universal Windows Driver</w:t>
+            </w:r>
+            <w:r>
+              <w:t xml:space="preserve">. Extract the ZIP completely (right-click → </w:t>
+            </w:r>
+            <w:r>
+              <w:rPr>
+                <w:b/>
+                <w:bCs/>
+              </w:rPr>
+              <w:t xml:space="preserve">Extract All</w:t>
+            </w:r>
+            <w:r>
+              <w:t xml:space="preserve">), open the extracted folder, right-click </w:t>
+            </w:r>
+            <w:r>
+              <w:rPr>
+                <w:rFonts w:ascii="Consolas" w:cs="Consolas" w:eastAsia="Consolas" w:hAnsi="Consolas"/>
+                <w:color w:val="9A2B2B"/>
+                <w:sz w:val="20"/>
+                <w:szCs w:val="20"/>
+              </w:rPr>
+              <w:t xml:space="preserve">silabser.inf</w:t>
+            </w:r>
+            <w:r>
+              <w:t xml:space="preserve"> → </w:t>
+            </w:r>
+            <w:r>
+              <w:rPr>
+                <w:b/>
+                <w:bCs/>
+              </w:rPr>
+              <w:t xml:space="preserve">Install</w:t>
+            </w:r>
+            <w:r>
+              <w:t xml:space="preserve">, and accept the administrator prompt.</w:t>
+            </w:r>
+          </w:p>
+          <w:p>
+            <w:pPr>
+              <w:pStyle w:val="ListParagraph"/>
+              <w:numPr>
+                <w:ilvl w:val="0"/>
+                <w:numId w:val="2"/>
+              </w:numPr>
+              <w:spacing w:after="50" w:line="276"/>
+            </w:pPr>
+            <w:r>
+              <w:rPr>
+                <w:b/>
+                <w:bCs/>
+              </w:rPr>
+              <w:t xml:space="preserve">macOS:</w:t>
+            </w:r>
+            <w:r>
+              <w:t xml:space="preserve"> </w:t>
+            </w:r>
+            <w:r>
+              <w:rPr>
+                <w:i/>
+                <w:iCs/>
+              </w:rPr>
+              <w:t xml:space="preserve">CP210x VCP Mac OSX Driver</w:t>
+            </w:r>
+            <w:r>
+              <w:t xml:space="preserve">. Open the ZIP, then the </w:t>
+            </w:r>
+            <w:r>
+              <w:rPr>
+                <w:rFonts w:ascii="Consolas" w:cs="Consolas" w:eastAsia="Consolas" w:hAnsi="Consolas"/>
+                <w:color w:val="9A2B2B"/>
+                <w:sz w:val="20"/>
+                <w:szCs w:val="20"/>
+              </w:rPr>
+              <w:t xml:space="preserve">.dmg</w:t>
+            </w:r>
+            <w:r>
+              <w:t xml:space="preserve">, and run the installer. If macOS blocks it, go to </w:t>
+            </w:r>
+            <w:r>
+              <w:rPr>
+                <w:b/>
+                <w:bCs/>
+              </w:rPr>
+              <w:t xml:space="preserve">System Settings → Privacy &amp; Security</w:t>
+            </w:r>
+            <w:r>
+              <w:t xml:space="preserve">, click </w:t>
+            </w:r>
+            <w:r>
+              <w:rPr>
+                <w:b/>
+                <w:bCs/>
+              </w:rPr>
+              <w:t xml:space="preserve">Allow</w:t>
+            </w:r>
+            <w:r>
+              <w:t xml:space="preserve">, and restart the computer.</w:t>
+            </w:r>
+          </w:p>
+          <w:p>
+            <w:pPr>
+              <w:spacing w:after="60" w:before="60" w:line="280"/>
+            </w:pPr>
+            <w:r>
+              <w:t xml:space="preserve">Then </w:t>
+            </w:r>
+            <w:r>
+              <w:rPr>
+                <w:b/>
+                <w:bCs/>
+              </w:rPr>
+              <w:t xml:space="preserve">unplug and replug the kit</w:t>
+            </w:r>
+            <w:r>
+              <w:t xml:space="preserve">. A port appears in </w:t>
+            </w:r>
+            <w:r>
+              <w:rPr>
+                <w:b/>
+                <w:bCs/>
+              </w:rPr>
+              <w:t xml:space="preserve">Tools → Port</w:t>
+            </w:r>
+            <w:r>
+              <w:t xml:space="preserve"> (</w:t>
+            </w:r>
+            <w:r>
+              <w:rPr>
+                <w:rFonts w:ascii="Consolas" w:cs="Consolas" w:eastAsia="Consolas" w:hAnsi="Consolas"/>
+                <w:color w:val="9A2B2B"/>
+                <w:sz w:val="20"/>
+                <w:szCs w:val="20"/>
+              </w:rPr>
+              <w:t xml:space="preserve">COMx</w:t>
+            </w:r>
+            <w:r>
+              <w:t xml:space="preserve"> on Windows, </w:t>
+            </w:r>
+            <w:r>
+              <w:rPr>
+                <w:rFonts w:ascii="Consolas" w:cs="Consolas" w:eastAsia="Consolas" w:hAnsi="Consolas"/>
+                <w:color w:val="9A2B2B"/>
+                <w:sz w:val="20"/>
+                <w:szCs w:val="20"/>
+              </w:rPr>
+              <w:t xml:space="preserve">/dev/cu...</w:t>
+            </w:r>
+            <w:r>
+              <w:t xml:space="preserve"> on macOS). On Windows you can also check in </w:t>
+            </w:r>
+            <w:r>
+              <w:rPr>
+                <w:b/>
+                <w:bCs/>
+              </w:rPr>
+              <w:t xml:space="preserve">Device Manager → Ports</w:t>
+            </w:r>
+            <w:r>
+              <w:t xml:space="preserve">: </w:t>
+            </w:r>
+            <w:r>
+              <w:rPr>
+                <w:i/>
+                <w:iCs/>
+              </w:rPr>
+              <w:t xml:space="preserve">Silicon Labs CP210x USB to UART Bridge (COMx)</w:t>
+            </w:r>
+            <w:r>
+              <w:t xml:space="preserve">.</w:t>
+            </w:r>
+          </w:p>
+          <w:p>
+            <w:pPr>
+              <w:spacing w:after="0" w:before="0" w:line="280"/>
+            </w:pPr>
+            <w:r>
+              <w:t xml:space="preserve">Still nothing? Try another USB cable (some are charge-only). Older kits (Seeeduino Lotus v1.0) use a CH340 chip and need the CH340 driver instead: ask the instructor.</w:t>
+            </w:r>
+          </w:p>
+        </w:tc>
+      </w:tr>
+    </w:tbl>
     <w:p>
       <w:pPr>
         <w:pStyle w:val="Heading2"/>
@@ -7763,7 +8055,23 @@
                 <w:sz w:val="20"/>
                 <w:szCs w:val="20"/>
               </w:rPr>
-              <w:t xml:space="preserve">Unplug and replug the USB cable, try another cable, then ask the instructor.</w:t>
+              <w:t xml:space="preserve">Install the </w:t>
+            </w:r>
+            <w:r>
+              <w:rPr>
+                <w:b/>
+                <w:bCs/>
+                <w:sz w:val="20"/>
+                <w:szCs w:val="20"/>
+              </w:rPr>
+              <w:t xml:space="preserve">Silicon Labs CP210x USB driver</w:t>
+            </w:r>
+            <w:r>
+              <w:rPr>
+                <w:sz w:val="20"/>
+                <w:szCs w:val="20"/>
+              </w:rPr>
+              <w:t xml:space="preserve">: see the box "No port in Tools → Port?" in part 0. Otherwise try another USB cable (some are charge-only) and ask the instructor.</w:t>
             </w:r>
           </w:p>
         </w:tc>

</xml_diff>